<commit_message>
DOC: Handbuch auf CSBG und beide Plattformen
Kontakt, Firma und Fusszeile tragen jetzt durchgehend CSBG und
gathmann@csbg.de. Der Hinweis auf die Namen consiness und consiness
Documizer bleibt im Lizenzkapitel - dort ist er die Aussage, dass sie
nicht mitlizenziert sind.

Dass neben S/4HANA auch das alte ERP unterstuetzt wird, stand bisher
nur in den Systemvoraussetzungen auf Seite 8. Jetzt steht es auf dem
Deckblatt, als eigener Punkt in "Auf einen Blick" und in den
Dateieigenschaften.

Co-Authored-By: Claude Opus 5 <noreply@anthropic.com>
</commit_message>
<xml_diff>
--- a/docs/Documizer_Produktdokumentation.docx
+++ b/docs/Documizer_Produktdokumentation.docx
@@ -61,7 +61,7 @@
           <w:sz w:val="18"/>
           <w:szCs w:val="18"/>
         </w:rPr>
-        <w:t xml:space="preserve">SAP S/4HANA · ON-PREMISE · KLASSISCHES ABAP</w:t>
+        <w:t xml:space="preserve">SAP S/4HANA UND SAP ERP · ON-PREMISE · KLASSISCHES ABAP</w:t>
       </w:r>
     </w:p>
     <w:p>
@@ -344,7 +344,7 @@
           <w:sz w:val="18"/>
           <w:szCs w:val="18"/>
         </w:rPr>
-        <w:t xml:space="preserve">Christian Gathmann · gathmann@consiness.de</w:t>
+        <w:t xml:space="preserve">Christian Gathmann · gathmann@csbg.de</w:t>
       </w:r>
     </w:p>
     <w:p>
@@ -356,7 +356,7 @@
           <w:sz w:val="18"/>
           <w:szCs w:val="18"/>
         </w:rPr>
-        <w:t xml:space="preserve">consiness GmbH &amp; Co. KG</w:t>
+        <w:t xml:space="preserve">C. Gathmann Computer-System-Beratung GmbH (CSBG), Bremen</w:t>
       </w:r>
     </w:p>
     <w:p>
@@ -731,6 +731,26 @@
           <w:b/>
           <w:bCs/>
         </w:rPr>
+        <w:t xml:space="preserve">Nicht nur S/4HANA.</w:t>
+      </w:r>
+      <w:r>
+        <w:t xml:space="preserve"> Dieselbe Quelle läuft im alten ERP — geprüft bis hinunter zu SAP_BASIS 7.40. Was es dort nicht gibt, sucht der Report dynamisch und lässt es leer, statt abzubrechen.</w:t>
+      </w:r>
+    </w:p>
+    <w:p>
+      <w:pPr>
+        <w:pStyle w:val="ListParagraph"/>
+        <w:numPr>
+          <w:ilvl w:val="0"/>
+          <w:numId w:val="2"/>
+        </w:numPr>
+        <w:spacing w:after="80" w:line="276"/>
+      </w:pPr>
+      <w:r>
+        <w:rPr>
+          <w:b/>
+          <w:bCs/>
+        </w:rPr>
         <w:t xml:space="preserve">Nie stillschweigend unvollständig.</w:t>
       </w:r>
       <w:r>
@@ -2884,7 +2904,23 @@
                 <w:sz w:val="18"/>
                 <w:szCs w:val="18"/>
               </w:rPr>
-              <w:t xml:space="preserve">SAP S/4HANA On-Premise oder ERP, klassisches ABAP</w:t>
+              <w:t xml:space="preserve">SAP S/4HANA On-Premise </w:t>
+            </w:r>
+            <w:r>
+              <w:rPr>
+                <w:b/>
+                <w:bCs/>
+                <w:sz w:val="18"/>
+                <w:szCs w:val="18"/>
+              </w:rPr>
+              <w:t xml:space="preserve">und</w:t>
+            </w:r>
+            <w:r>
+              <w:rPr>
+                <w:sz w:val="18"/>
+                <w:szCs w:val="18"/>
+              </w:rPr>
+              <w:t xml:space="preserve"> SAP ERP (R/3), klassisches ABAP</w:t>
             </w:r>
           </w:p>
         </w:tc>
@@ -12671,7 +12707,7 @@
           <w:sz w:val="24"/>
           <w:szCs w:val="24"/>
         </w:rPr>
-        <w:t xml:space="preserve">gathmann@consiness.de</w:t>
+        <w:t xml:space="preserve">gathmann@csbg.de</w:t>
       </w:r>
     </w:p>
     <w:p>
@@ -12684,7 +12720,7 @@
           <w:sz w:val="22"/>
           <w:szCs w:val="22"/>
         </w:rPr>
-        <w:t xml:space="preserve">consiness GmbH &amp; Co. KG</w:t>
+        <w:t xml:space="preserve">C. Gathmann Computer-System-Beratung GmbH (CSBG), Bremen</w:t>
       </w:r>
     </w:p>
     <w:p>
@@ -12772,7 +12808,7 @@
         <w:sz w:val="15"/>
         <w:szCs w:val="15"/>
       </w:rPr>
-      <w:t xml:space="preserve">Documizer · Christian Gathmann · gathmann@consiness.de</w:t>
+      <w:t xml:space="preserve">Documizer · Christian Gathmann · gathmann@csbg.de</w:t>
     </w:r>
     <w:r>
       <w:ptab w:alignment="right" w:relativeTo="margin" w:leader="none"/>

</xml_diff>

<commit_message>
DOC: Handbuch traegt das CSBG-Logo und dessen Markenblau
Logo von csbg.de (184x64, RGBA) auf Deckblatt, in der Kopfzeile jeder
Seite und auf der Kontaktseite, mit dem Seitenverhaeltnis des Originals.

Die Akzentfarbe zieht mit: aus dem Logo ausgelesene #0063A6 statt des
bisherigen Rots, ein heller Anstrich davon fuer die Kaesten und ein
dunkleres Blau fuer Inline-Code. Ein blaues Logo in einem rot
akzentuierten Dokument beisst sich; die Farbe steht als eine Konstante
im Aufbauskript und laesst sich in einer Zeile zurueckdrehen.

Das consiness-Logo bleibt liegen - die englische Fassung traegt noch
diese Marke.

Co-Authored-By: Claude Opus 5 <noreply@anthropic.com>
</commit_message>
<xml_diff>
--- a/docs/Documizer_Produktdokumentation.docx
+++ b/docs/Documizer_Produktdokumentation.docx
@@ -10,7 +10,7 @@
       <w:r>
         <w:drawing>
           <wp:inline distT="0" distB="0" distL="0" distR="0">
-            <wp:extent cx="1809750" cy="581025"/>
+            <wp:extent cx="1809750" cy="628650"/>
             <wp:effectExtent t="0" r="0" b="0" l="0"/>
             <wp:docPr id="1" name="" descr="" title=""/>
             <wp:cNvGraphicFramePr>
@@ -35,7 +35,7 @@
                   <pic:spPr bwMode="auto">
                     <a:xfrm>
                       <a:off x="0" y="0"/>
-                      <a:ext cx="1809750" cy="581025"/>
+                      <a:ext cx="1809750" cy="628650"/>
                     </a:xfrm>
                     <a:prstGeom prst="rect">
                       <a:avLst/>
@@ -56,7 +56,7 @@
         <w:rPr>
           <w:b/>
           <w:bCs/>
-          <w:color w:val="D71920"/>
+          <w:color w:val="0063A6"/>
           <w:spacing w:val="40"/>
           <w:sz w:val="18"/>
           <w:szCs w:val="18"/>
@@ -95,7 +95,7 @@
     <w:p>
       <w:pPr>
         <w:pBdr>
-          <w:bottom w:val="single" w:color="D71920" w:sz="24" w:space="18"/>
+          <w:bottom w:val="single" w:color="0063A6" w:sz="24" w:space="18"/>
         </w:pBdr>
         <w:spacing w:after="480"/>
       </w:pPr>
@@ -143,7 +143,7 @@
       <w:tblPr>
         <w:tblW w:type="dxa" w:w="9638"/>
         <w:tblBorders>
-          <w:top w:val="single" w:color="D71920" w:sz="18"/>
+          <w:top w:val="single" w:color="0063A6" w:sz="18"/>
           <w:left w:val="none" w:color="FFFFFF" w:sz="0"/>
           <w:bottom w:val="none" w:color="FFFFFF" w:sz="0"/>
           <w:right w:val="none" w:color="FFFFFF" w:sz="0"/>
@@ -176,7 +176,7 @@
               <w:rPr>
                 <w:b/>
                 <w:bCs/>
-                <w:color w:val="D71920"/>
+                <w:color w:val="0063A6"/>
                 <w:sz w:val="44"/>
                 <w:szCs w:val="44"/>
               </w:rPr>
@@ -215,7 +215,7 @@
               <w:rPr>
                 <w:b/>
                 <w:bCs/>
-                <w:color w:val="D71920"/>
+                <w:color w:val="0063A6"/>
                 <w:sz w:val="44"/>
                 <w:szCs w:val="44"/>
               </w:rPr>
@@ -254,7 +254,7 @@
               <w:rPr>
                 <w:b/>
                 <w:bCs/>
-                <w:color w:val="D71920"/>
+                <w:color w:val="0063A6"/>
                 <w:sz w:val="44"/>
                 <w:szCs w:val="44"/>
               </w:rPr>
@@ -293,7 +293,7 @@
               <w:rPr>
                 <w:b/>
                 <w:bCs/>
-                <w:color w:val="D71920"/>
+                <w:color w:val="0063A6"/>
                 <w:sz w:val="44"/>
                 <w:szCs w:val="44"/>
               </w:rPr>
@@ -417,7 +417,7 @@
           <w:tcPr>
             <w:tcW w:type="dxa" w:w="3092"/>
             <w:tcBorders>
-              <w:top w:val="single" w:color="D71920" w:sz="18"/>
+              <w:top w:val="single" w:color="0063A6" w:sz="18"/>
               <w:left w:val="none" w:color="FFFFFF" w:sz="0"/>
               <w:bottom w:val="none" w:color="FFFFFF" w:sz="0"/>
               <w:right w:val="none" w:color="FFFFFF" w:sz="0"/>
@@ -437,7 +437,7 @@
             <w:r>
               <w:rPr>
                 <w:rFonts w:ascii="Consolas" w:cs="Consolas" w:eastAsia="Consolas" w:hAnsi="Consolas"/>
-                <w:color w:val="D71920"/>
+                <w:color w:val="0063A6"/>
                 <w:sz w:val="16"/>
                 <w:szCs w:val="16"/>
               </w:rPr>
@@ -492,7 +492,7 @@
           <w:tcPr>
             <w:tcW w:type="dxa" w:w="3092"/>
             <w:tcBorders>
-              <w:top w:val="single" w:color="D71920" w:sz="18"/>
+              <w:top w:val="single" w:color="0063A6" w:sz="18"/>
               <w:left w:val="none" w:color="FFFFFF" w:sz="0"/>
               <w:bottom w:val="none" w:color="FFFFFF" w:sz="0"/>
               <w:right w:val="none" w:color="FFFFFF" w:sz="0"/>
@@ -512,7 +512,7 @@
             <w:r>
               <w:rPr>
                 <w:rFonts w:ascii="Consolas" w:cs="Consolas" w:eastAsia="Consolas" w:hAnsi="Consolas"/>
-                <w:color w:val="D71920"/>
+                <w:color w:val="0063A6"/>
                 <w:sz w:val="16"/>
                 <w:szCs w:val="16"/>
               </w:rPr>
@@ -567,7 +567,7 @@
           <w:tcPr>
             <w:tcW w:type="dxa" w:w="3092"/>
             <w:tcBorders>
-              <w:top w:val="single" w:color="D71920" w:sz="18"/>
+              <w:top w:val="single" w:color="0063A6" w:sz="18"/>
               <w:left w:val="none" w:color="FFFFFF" w:sz="0"/>
               <w:bottom w:val="none" w:color="FFFFFF" w:sz="0"/>
               <w:right w:val="none" w:color="FFFFFF" w:sz="0"/>
@@ -587,7 +587,7 @@
             <w:r>
               <w:rPr>
                 <w:rFonts w:ascii="Consolas" w:cs="Consolas" w:eastAsia="Consolas" w:hAnsi="Consolas"/>
-                <w:color w:val="D71920"/>
+                <w:color w:val="0063A6"/>
                 <w:sz w:val="16"/>
                 <w:szCs w:val="16"/>
               </w:rPr>
@@ -810,7 +810,7 @@
         <w:rPr>
           <w:b/>
           <w:bCs/>
-          <w:color w:val="D71920"/>
+          <w:color w:val="0063A6"/>
           <w:sz w:val="36"/>
           <w:szCs w:val="36"/>
         </w:rPr>
@@ -889,7 +889,7 @@
         <w:tc>
           <w:tcPr>
             <w:tcW w:type="dxa" w:w="4600"/>
-            <w:shd w:fill="D71920" w:color="auto" w:val="clear"/>
+            <w:shd w:fill="0063A6" w:color="auto" w:val="clear"/>
             <w:tcMar>
               <w:top w:type="dxa" w:w="70"/>
               <w:left w:type="dxa" w:w="110"/>
@@ -917,7 +917,7 @@
         <w:tc>
           <w:tcPr>
             <w:tcW w:type="dxa" w:w="5038"/>
-            <w:shd w:fill="D71920" w:color="auto" w:val="clear"/>
+            <w:shd w:fill="0063A6" w:color="auto" w:val="clear"/>
             <w:tcMar>
               <w:top w:type="dxa" w:w="70"/>
               <w:left w:type="dxa" w:w="110"/>
@@ -1262,7 +1262,7 @@
         <w:tblW w:type="dxa" w:w="9638"/>
         <w:tblBorders>
           <w:top w:val="none" w:color="FFFFFF" w:sz="0"/>
-          <w:left w:val="single" w:color="D71920" w:sz="24"/>
+          <w:left w:val="single" w:color="0063A6" w:sz="24"/>
           <w:bottom w:val="none" w:color="FFFFFF" w:sz="0"/>
           <w:right w:val="none" w:color="FFFFFF" w:sz="0"/>
           <w:insideH w:val="none" w:color="FFFFFF" w:sz="0"/>
@@ -1279,7 +1279,7 @@
         <w:tc>
           <w:tcPr>
             <w:tcW w:type="dxa" w:w="9638"/>
-            <w:shd w:fill="FCEDEE" w:color="auto" w:val="clear"/>
+            <w:shd w:fill="E9F2F8" w:color="auto" w:val="clear"/>
             <w:tcMar>
               <w:top w:type="dxa" w:w="140"/>
               <w:left w:type="dxa" w:w="220"/>
@@ -1295,7 +1295,7 @@
               <w:rPr>
                 <w:b/>
                 <w:bCs/>
-                <w:color w:val="D71920"/>
+                <w:color w:val="0063A6"/>
                 <w:sz w:val="20"/>
                 <w:szCs w:val="20"/>
               </w:rPr>
@@ -1457,7 +1457,7 @@
         <w:tblW w:type="dxa" w:w="9638"/>
         <w:tblBorders>
           <w:top w:val="none" w:color="FFFFFF" w:sz="0"/>
-          <w:left w:val="single" w:color="D71920" w:sz="24"/>
+          <w:left w:val="single" w:color="0063A6" w:sz="24"/>
           <w:bottom w:val="none" w:color="FFFFFF" w:sz="0"/>
           <w:right w:val="none" w:color="FFFFFF" w:sz="0"/>
           <w:insideH w:val="none" w:color="FFFFFF" w:sz="0"/>
@@ -1474,7 +1474,7 @@
         <w:tc>
           <w:tcPr>
             <w:tcW w:type="dxa" w:w="9638"/>
-            <w:shd w:fill="FCEDEE" w:color="auto" w:val="clear"/>
+            <w:shd w:fill="E9F2F8" w:color="auto" w:val="clear"/>
             <w:tcMar>
               <w:top w:type="dxa" w:w="140"/>
               <w:left w:type="dxa" w:w="220"/>
@@ -1490,7 +1490,7 @@
               <w:rPr>
                 <w:b/>
                 <w:bCs/>
-                <w:color w:val="D71920"/>
+                <w:color w:val="0063A6"/>
                 <w:sz w:val="20"/>
                 <w:szCs w:val="20"/>
               </w:rPr>
@@ -1630,7 +1630,7 @@
         <w:tblW w:type="dxa" w:w="9638"/>
         <w:tblBorders>
           <w:top w:val="none" w:color="FFFFFF" w:sz="0"/>
-          <w:left w:val="single" w:color="D71920" w:sz="24"/>
+          <w:left w:val="single" w:color="0063A6" w:sz="24"/>
           <w:bottom w:val="none" w:color="FFFFFF" w:sz="0"/>
           <w:right w:val="none" w:color="FFFFFF" w:sz="0"/>
           <w:insideH w:val="none" w:color="FFFFFF" w:sz="0"/>
@@ -1647,7 +1647,7 @@
         <w:tc>
           <w:tcPr>
             <w:tcW w:type="dxa" w:w="9638"/>
-            <w:shd w:fill="FCEDEE" w:color="auto" w:val="clear"/>
+            <w:shd w:fill="E9F2F8" w:color="auto" w:val="clear"/>
             <w:tcMar>
               <w:top w:type="dxa" w:w="140"/>
               <w:left w:type="dxa" w:w="220"/>
@@ -1663,7 +1663,7 @@
               <w:rPr>
                 <w:b/>
                 <w:bCs/>
-                <w:color w:val="D71920"/>
+                <w:color w:val="0063A6"/>
                 <w:sz w:val="20"/>
                 <w:szCs w:val="20"/>
               </w:rPr>
@@ -1803,7 +1803,7 @@
         <w:tblW w:type="dxa" w:w="9638"/>
         <w:tblBorders>
           <w:top w:val="none" w:color="FFFFFF" w:sz="0"/>
-          <w:left w:val="single" w:color="D71920" w:sz="24"/>
+          <w:left w:val="single" w:color="0063A6" w:sz="24"/>
           <w:bottom w:val="none" w:color="FFFFFF" w:sz="0"/>
           <w:right w:val="none" w:color="FFFFFF" w:sz="0"/>
           <w:insideH w:val="none" w:color="FFFFFF" w:sz="0"/>
@@ -1820,7 +1820,7 @@
         <w:tc>
           <w:tcPr>
             <w:tcW w:type="dxa" w:w="9638"/>
-            <w:shd w:fill="FCEDEE" w:color="auto" w:val="clear"/>
+            <w:shd w:fill="E9F2F8" w:color="auto" w:val="clear"/>
             <w:tcMar>
               <w:top w:type="dxa" w:w="140"/>
               <w:left w:type="dxa" w:w="220"/>
@@ -1836,7 +1836,7 @@
               <w:rPr>
                 <w:b/>
                 <w:bCs/>
-                <w:color w:val="D71920"/>
+                <w:color w:val="0063A6"/>
                 <w:sz w:val="20"/>
                 <w:szCs w:val="20"/>
               </w:rPr>
@@ -1976,7 +1976,7 @@
         <w:tblW w:type="dxa" w:w="9638"/>
         <w:tblBorders>
           <w:top w:val="none" w:color="FFFFFF" w:sz="0"/>
-          <w:left w:val="single" w:color="D71920" w:sz="24"/>
+          <w:left w:val="single" w:color="0063A6" w:sz="24"/>
           <w:bottom w:val="none" w:color="FFFFFF" w:sz="0"/>
           <w:right w:val="none" w:color="FFFFFF" w:sz="0"/>
           <w:insideH w:val="none" w:color="FFFFFF" w:sz="0"/>
@@ -1993,7 +1993,7 @@
         <w:tc>
           <w:tcPr>
             <w:tcW w:type="dxa" w:w="9638"/>
-            <w:shd w:fill="FCEDEE" w:color="auto" w:val="clear"/>
+            <w:shd w:fill="E9F2F8" w:color="auto" w:val="clear"/>
             <w:tcMar>
               <w:top w:type="dxa" w:w="140"/>
               <w:left w:type="dxa" w:w="220"/>
@@ -2009,7 +2009,7 @@
               <w:rPr>
                 <w:b/>
                 <w:bCs/>
-                <w:color w:val="D71920"/>
+                <w:color w:val="0063A6"/>
                 <w:sz w:val="20"/>
                 <w:szCs w:val="20"/>
               </w:rPr>
@@ -2136,7 +2136,7 @@
         <w:tblW w:type="dxa" w:w="9638"/>
         <w:tblBorders>
           <w:top w:val="none" w:color="FFFFFF" w:sz="0"/>
-          <w:left w:val="single" w:color="D71920" w:sz="24"/>
+          <w:left w:val="single" w:color="0063A6" w:sz="24"/>
           <w:bottom w:val="none" w:color="FFFFFF" w:sz="0"/>
           <w:right w:val="none" w:color="FFFFFF" w:sz="0"/>
           <w:insideH w:val="none" w:color="FFFFFF" w:sz="0"/>
@@ -2153,7 +2153,7 @@
         <w:tc>
           <w:tcPr>
             <w:tcW w:type="dxa" w:w="9638"/>
-            <w:shd w:fill="FCEDEE" w:color="auto" w:val="clear"/>
+            <w:shd w:fill="E9F2F8" w:color="auto" w:val="clear"/>
             <w:tcMar>
               <w:top w:type="dxa" w:w="140"/>
               <w:left w:type="dxa" w:w="220"/>
@@ -2169,7 +2169,7 @@
               <w:rPr>
                 <w:b/>
                 <w:bCs/>
-                <w:color w:val="D71920"/>
+                <w:color w:val="0063A6"/>
                 <w:sz w:val="20"/>
                 <w:szCs w:val="20"/>
               </w:rPr>
@@ -2296,7 +2296,7 @@
         <w:tblW w:type="dxa" w:w="9638"/>
         <w:tblBorders>
           <w:top w:val="none" w:color="FFFFFF" w:sz="0"/>
-          <w:left w:val="single" w:color="D71920" w:sz="24"/>
+          <w:left w:val="single" w:color="0063A6" w:sz="24"/>
           <w:bottom w:val="none" w:color="FFFFFF" w:sz="0"/>
           <w:right w:val="none" w:color="FFFFFF" w:sz="0"/>
           <w:insideH w:val="none" w:color="FFFFFF" w:sz="0"/>
@@ -2313,7 +2313,7 @@
         <w:tc>
           <w:tcPr>
             <w:tcW w:type="dxa" w:w="9638"/>
-            <w:shd w:fill="FCEDEE" w:color="auto" w:val="clear"/>
+            <w:shd w:fill="E9F2F8" w:color="auto" w:val="clear"/>
             <w:tcMar>
               <w:top w:type="dxa" w:w="140"/>
               <w:left w:type="dxa" w:w="220"/>
@@ -2329,7 +2329,7 @@
               <w:rPr>
                 <w:b/>
                 <w:bCs/>
-                <w:color w:val="D71920"/>
+                <w:color w:val="0063A6"/>
                 <w:sz w:val="20"/>
                 <w:szCs w:val="20"/>
               </w:rPr>
@@ -2456,7 +2456,7 @@
         <w:tblW w:type="dxa" w:w="9638"/>
         <w:tblBorders>
           <w:top w:val="none" w:color="FFFFFF" w:sz="0"/>
-          <w:left w:val="single" w:color="D71920" w:sz="24"/>
+          <w:left w:val="single" w:color="0063A6" w:sz="24"/>
           <w:bottom w:val="none" w:color="FFFFFF" w:sz="0"/>
           <w:right w:val="none" w:color="FFFFFF" w:sz="0"/>
           <w:insideH w:val="none" w:color="FFFFFF" w:sz="0"/>
@@ -2473,7 +2473,7 @@
         <w:tc>
           <w:tcPr>
             <w:tcW w:type="dxa" w:w="9638"/>
-            <w:shd w:fill="FCEDEE" w:color="auto" w:val="clear"/>
+            <w:shd w:fill="E9F2F8" w:color="auto" w:val="clear"/>
             <w:tcMar>
               <w:top w:type="dxa" w:w="140"/>
               <w:left w:type="dxa" w:w="220"/>
@@ -2489,7 +2489,7 @@
               <w:rPr>
                 <w:b/>
                 <w:bCs/>
-                <w:color w:val="D71920"/>
+                <w:color w:val="0063A6"/>
                 <w:sz w:val="20"/>
                 <w:szCs w:val="20"/>
               </w:rPr>
@@ -2553,7 +2553,7 @@
       <w:r>
         <w:rPr>
           <w:rFonts w:ascii="Consolas" w:cs="Consolas" w:eastAsia="Consolas" w:hAnsi="Consolas"/>
-          <w:color w:val="8C1117"/>
+          <w:color w:val="0A4D80"/>
           <w:sz w:val="19"/>
           <w:szCs w:val="19"/>
         </w:rPr>
@@ -2629,7 +2629,7 @@
         <w:tblW w:type="dxa" w:w="9638"/>
         <w:tblBorders>
           <w:top w:val="none" w:color="FFFFFF" w:sz="0"/>
-          <w:left w:val="single" w:color="D71920" w:sz="24"/>
+          <w:left w:val="single" w:color="0063A6" w:sz="24"/>
           <w:bottom w:val="none" w:color="FFFFFF" w:sz="0"/>
           <w:right w:val="none" w:color="FFFFFF" w:sz="0"/>
           <w:insideH w:val="none" w:color="FFFFFF" w:sz="0"/>
@@ -2646,7 +2646,7 @@
         <w:tc>
           <w:tcPr>
             <w:tcW w:type="dxa" w:w="9638"/>
-            <w:shd w:fill="FCEDEE" w:color="auto" w:val="clear"/>
+            <w:shd w:fill="E9F2F8" w:color="auto" w:val="clear"/>
             <w:tcMar>
               <w:top w:type="dxa" w:w="140"/>
               <w:left w:type="dxa" w:w="220"/>
@@ -2662,7 +2662,7 @@
               <w:rPr>
                 <w:b/>
                 <w:bCs/>
-                <w:color w:val="D71920"/>
+                <w:color w:val="0063A6"/>
                 <w:sz w:val="20"/>
                 <w:szCs w:val="20"/>
               </w:rPr>
@@ -2695,7 +2695,7 @@
             <w:r>
               <w:rPr>
                 <w:rFonts w:ascii="Consolas" w:cs="Consolas" w:eastAsia="Consolas" w:hAnsi="Consolas"/>
-                <w:color w:val="8C1117"/>
+                <w:color w:val="0A4D80"/>
                 <w:sz w:val="18"/>
                 <w:szCs w:val="18"/>
               </w:rPr>
@@ -2711,7 +2711,7 @@
             <w:r>
               <w:rPr>
                 <w:rFonts w:ascii="Consolas" w:cs="Consolas" w:eastAsia="Consolas" w:hAnsi="Consolas"/>
-                <w:color w:val="8C1117"/>
+                <w:color w:val="0A4D80"/>
                 <w:sz w:val="18"/>
                 <w:szCs w:val="18"/>
               </w:rPr>
@@ -2751,7 +2751,7 @@
       <w:r>
         <w:rPr>
           <w:rFonts w:ascii="Consolas" w:cs="Consolas" w:eastAsia="Consolas" w:hAnsi="Consolas"/>
-          <w:color w:val="8C1117"/>
+          <w:color w:val="0A4D80"/>
           <w:sz w:val="19"/>
           <w:szCs w:val="19"/>
         </w:rPr>
@@ -2802,7 +2802,7 @@
         <w:tc>
           <w:tcPr>
             <w:tcW w:type="dxa" w:w="3000"/>
-            <w:shd w:fill="D71920" w:color="auto" w:val="clear"/>
+            <w:shd w:fill="0063A6" w:color="auto" w:val="clear"/>
             <w:tcMar>
               <w:top w:type="dxa" w:w="70"/>
               <w:left w:type="dxa" w:w="110"/>
@@ -2830,7 +2830,7 @@
         <w:tc>
           <w:tcPr>
             <w:tcW w:type="dxa" w:w="6638"/>
-            <w:shd w:fill="D71920" w:color="auto" w:val="clear"/>
+            <w:shd w:fill="0063A6" w:color="auto" w:val="clear"/>
             <w:tcMar>
               <w:top w:type="dxa" w:w="70"/>
               <w:left w:type="dxa" w:w="110"/>
@@ -2980,7 +2980,7 @@
             <w:r>
               <w:rPr>
                 <w:rFonts w:ascii="Consolas" w:cs="Consolas" w:eastAsia="Consolas" w:hAnsi="Consolas"/>
-                <w:color w:val="8C1117"/>
+                <w:color w:val="0A4D80"/>
                 <w:sz w:val="16"/>
                 <w:szCs w:val="16"/>
               </w:rPr>
@@ -2996,7 +2996,7 @@
             <w:r>
               <w:rPr>
                 <w:rFonts w:ascii="Consolas" w:cs="Consolas" w:eastAsia="Consolas" w:hAnsi="Consolas"/>
-                <w:color w:val="8C1117"/>
+                <w:color w:val="0A4D80"/>
                 <w:sz w:val="16"/>
                 <w:szCs w:val="16"/>
               </w:rPr>
@@ -3065,7 +3065,7 @@
             <w:r>
               <w:rPr>
                 <w:rFonts w:ascii="Consolas" w:cs="Consolas" w:eastAsia="Consolas" w:hAnsi="Consolas"/>
-                <w:color w:val="8C1117"/>
+                <w:color w:val="0A4D80"/>
                 <w:sz w:val="16"/>
                 <w:szCs w:val="16"/>
               </w:rPr>
@@ -3122,7 +3122,7 @@
             <w:r>
               <w:rPr>
                 <w:rFonts w:ascii="Consolas" w:cs="Consolas" w:eastAsia="Consolas" w:hAnsi="Consolas"/>
-                <w:color w:val="8C1117"/>
+                <w:color w:val="0A4D80"/>
                 <w:sz w:val="16"/>
                 <w:szCs w:val="16"/>
               </w:rPr>
@@ -3202,7 +3202,7 @@
         <w:tblW w:type="dxa" w:w="9638"/>
         <w:tblBorders>
           <w:top w:val="none" w:color="FFFFFF" w:sz="0"/>
-          <w:left w:val="single" w:color="D71920" w:sz="24"/>
+          <w:left w:val="single" w:color="0063A6" w:sz="24"/>
           <w:bottom w:val="none" w:color="FFFFFF" w:sz="0"/>
           <w:right w:val="none" w:color="FFFFFF" w:sz="0"/>
           <w:insideH w:val="none" w:color="FFFFFF" w:sz="0"/>
@@ -3219,7 +3219,7 @@
         <w:tc>
           <w:tcPr>
             <w:tcW w:type="dxa" w:w="9638"/>
-            <w:shd w:fill="FCEDEE" w:color="auto" w:val="clear"/>
+            <w:shd w:fill="E9F2F8" w:color="auto" w:val="clear"/>
             <w:tcMar>
               <w:top w:type="dxa" w:w="140"/>
               <w:left w:type="dxa" w:w="220"/>
@@ -3235,7 +3235,7 @@
               <w:rPr>
                 <w:b/>
                 <w:bCs/>
-                <w:color w:val="D71920"/>
+                <w:color w:val="0063A6"/>
                 <w:sz w:val="20"/>
                 <w:szCs w:val="20"/>
               </w:rPr>
@@ -3502,7 +3502,7 @@
         <w:tc>
           <w:tcPr>
             <w:tcW w:type="dxa" w:w="3500"/>
-            <w:shd w:fill="D71920" w:color="auto" w:val="clear"/>
+            <w:shd w:fill="0063A6" w:color="auto" w:val="clear"/>
             <w:tcMar>
               <w:top w:type="dxa" w:w="70"/>
               <w:left w:type="dxa" w:w="110"/>
@@ -3530,7 +3530,7 @@
         <w:tc>
           <w:tcPr>
             <w:tcW w:type="dxa" w:w="1300"/>
-            <w:shd w:fill="D71920" w:color="auto" w:val="clear"/>
+            <w:shd w:fill="0063A6" w:color="auto" w:val="clear"/>
             <w:tcMar>
               <w:top w:type="dxa" w:w="70"/>
               <w:left w:type="dxa" w:w="110"/>
@@ -3558,7 +3558,7 @@
         <w:tc>
           <w:tcPr>
             <w:tcW w:type="dxa" w:w="4838"/>
-            <w:shd w:fill="D71920" w:color="auto" w:val="clear"/>
+            <w:shd w:fill="0063A6" w:color="auto" w:val="clear"/>
             <w:tcMar>
               <w:top w:type="dxa" w:w="70"/>
               <w:left w:type="dxa" w:w="110"/>
@@ -4242,7 +4242,7 @@
       <w:r>
         <w:rPr>
           <w:rFonts w:ascii="Consolas" w:cs="Consolas" w:eastAsia="Consolas" w:hAnsi="Consolas"/>
-          <w:color w:val="8C1117"/>
+          <w:color w:val="0A4D80"/>
           <w:sz w:val="19"/>
           <w:szCs w:val="19"/>
         </w:rPr>
@@ -4291,7 +4291,7 @@
         <w:tblW w:type="dxa" w:w="9638"/>
         <w:tblBorders>
           <w:top w:val="none" w:color="FFFFFF" w:sz="0"/>
-          <w:left w:val="single" w:color="D71920" w:sz="24"/>
+          <w:left w:val="single" w:color="0063A6" w:sz="24"/>
           <w:bottom w:val="none" w:color="FFFFFF" w:sz="0"/>
           <w:right w:val="none" w:color="FFFFFF" w:sz="0"/>
           <w:insideH w:val="none" w:color="FFFFFF" w:sz="0"/>
@@ -4308,7 +4308,7 @@
         <w:tc>
           <w:tcPr>
             <w:tcW w:type="dxa" w:w="9638"/>
-            <w:shd w:fill="FCEDEE" w:color="auto" w:val="clear"/>
+            <w:shd w:fill="E9F2F8" w:color="auto" w:val="clear"/>
             <w:tcMar>
               <w:top w:type="dxa" w:w="140"/>
               <w:left w:type="dxa" w:w="220"/>
@@ -4324,7 +4324,7 @@
               <w:rPr>
                 <w:b/>
                 <w:bCs/>
-                <w:color w:val="D71920"/>
+                <w:color w:val="0063A6"/>
                 <w:sz w:val="20"/>
                 <w:szCs w:val="20"/>
               </w:rPr>
@@ -4438,7 +4438,7 @@
         <w:tc>
           <w:tcPr>
             <w:tcW w:type="dxa" w:w="3800"/>
-            <w:shd w:fill="D71920" w:color="auto" w:val="clear"/>
+            <w:shd w:fill="0063A6" w:color="auto" w:val="clear"/>
             <w:tcMar>
               <w:top w:type="dxa" w:w="70"/>
               <w:left w:type="dxa" w:w="110"/>
@@ -4466,7 +4466,7 @@
         <w:tc>
           <w:tcPr>
             <w:tcW w:type="dxa" w:w="5838"/>
-            <w:shd w:fill="D71920" w:color="auto" w:val="clear"/>
+            <w:shd w:fill="0063A6" w:color="auto" w:val="clear"/>
             <w:tcMar>
               <w:top w:type="dxa" w:w="70"/>
               <w:left w:type="dxa" w:w="110"/>
@@ -4784,7 +4784,7 @@
         <w:tblW w:type="dxa" w:w="9638"/>
         <w:tblBorders>
           <w:top w:val="none" w:color="FFFFFF" w:sz="0"/>
-          <w:left w:val="single" w:color="D71920" w:sz="24"/>
+          <w:left w:val="single" w:color="0063A6" w:sz="24"/>
           <w:bottom w:val="none" w:color="FFFFFF" w:sz="0"/>
           <w:right w:val="none" w:color="FFFFFF" w:sz="0"/>
           <w:insideH w:val="none" w:color="FFFFFF" w:sz="0"/>
@@ -4801,7 +4801,7 @@
         <w:tc>
           <w:tcPr>
             <w:tcW w:type="dxa" w:w="9638"/>
-            <w:shd w:fill="FCEDEE" w:color="auto" w:val="clear"/>
+            <w:shd w:fill="E9F2F8" w:color="auto" w:val="clear"/>
             <w:tcMar>
               <w:top w:type="dxa" w:w="140"/>
               <w:left w:type="dxa" w:w="220"/>
@@ -4817,7 +4817,7 @@
               <w:rPr>
                 <w:b/>
                 <w:bCs/>
-                <w:color w:val="D71920"/>
+                <w:color w:val="0063A6"/>
                 <w:sz w:val="20"/>
                 <w:szCs w:val="20"/>
               </w:rPr>
@@ -4899,7 +4899,7 @@
         <w:tc>
           <w:tcPr>
             <w:tcW w:type="dxa" w:w="900"/>
-            <w:shd w:fill="D71920" w:color="auto" w:val="clear"/>
+            <w:shd w:fill="0063A6" w:color="auto" w:val="clear"/>
             <w:tcMar>
               <w:top w:type="dxa" w:w="70"/>
               <w:left w:type="dxa" w:w="110"/>
@@ -4927,7 +4927,7 @@
         <w:tc>
           <w:tcPr>
             <w:tcW w:type="dxa" w:w="3919"/>
-            <w:shd w:fill="D71920" w:color="auto" w:val="clear"/>
+            <w:shd w:fill="0063A6" w:color="auto" w:val="clear"/>
             <w:tcMar>
               <w:top w:type="dxa" w:w="70"/>
               <w:left w:type="dxa" w:w="110"/>
@@ -4955,7 +4955,7 @@
         <w:tc>
           <w:tcPr>
             <w:tcW w:type="dxa" w:w="900"/>
-            <w:shd w:fill="D71920" w:color="auto" w:val="clear"/>
+            <w:shd w:fill="0063A6" w:color="auto" w:val="clear"/>
             <w:tcMar>
               <w:top w:type="dxa" w:w="70"/>
               <w:left w:type="dxa" w:w="110"/>
@@ -4983,7 +4983,7 @@
         <w:tc>
           <w:tcPr>
             <w:tcW w:type="dxa" w:w="3919"/>
-            <w:shd w:fill="D71920" w:color="auto" w:val="clear"/>
+            <w:shd w:fill="0063A6" w:color="auto" w:val="clear"/>
             <w:tcMar>
               <w:top w:type="dxa" w:w="70"/>
               <w:left w:type="dxa" w:w="110"/>
@@ -5031,7 +5031,7 @@
             <w:r>
               <w:rPr>
                 <w:rFonts w:ascii="Consolas" w:cs="Consolas" w:eastAsia="Consolas" w:hAnsi="Consolas"/>
-                <w:color w:val="8C1117"/>
+                <w:color w:val="0A4D80"/>
                 <w:sz w:val="16"/>
                 <w:szCs w:val="16"/>
               </w:rPr>
@@ -5081,7 +5081,7 @@
             <w:r>
               <w:rPr>
                 <w:rFonts w:ascii="Consolas" w:cs="Consolas" w:eastAsia="Consolas" w:hAnsi="Consolas"/>
-                <w:color w:val="8C1117"/>
+                <w:color w:val="0A4D80"/>
                 <w:sz w:val="16"/>
                 <w:szCs w:val="16"/>
               </w:rPr>
@@ -5137,7 +5137,7 @@
             <w:r>
               <w:rPr>
                 <w:rFonts w:ascii="Consolas" w:cs="Consolas" w:eastAsia="Consolas" w:hAnsi="Consolas"/>
-                <w:color w:val="8C1117"/>
+                <w:color w:val="0A4D80"/>
                 <w:sz w:val="16"/>
                 <w:szCs w:val="16"/>
               </w:rPr>
@@ -5189,7 +5189,7 @@
             <w:r>
               <w:rPr>
                 <w:rFonts w:ascii="Consolas" w:cs="Consolas" w:eastAsia="Consolas" w:hAnsi="Consolas"/>
-                <w:color w:val="8C1117"/>
+                <w:color w:val="0A4D80"/>
                 <w:sz w:val="16"/>
                 <w:szCs w:val="16"/>
               </w:rPr>
@@ -5245,7 +5245,7 @@
             <w:r>
               <w:rPr>
                 <w:rFonts w:ascii="Consolas" w:cs="Consolas" w:eastAsia="Consolas" w:hAnsi="Consolas"/>
-                <w:color w:val="8C1117"/>
+                <w:color w:val="0A4D80"/>
                 <w:sz w:val="16"/>
                 <w:szCs w:val="16"/>
               </w:rPr>
@@ -5295,7 +5295,7 @@
             <w:r>
               <w:rPr>
                 <w:rFonts w:ascii="Consolas" w:cs="Consolas" w:eastAsia="Consolas" w:hAnsi="Consolas"/>
-                <w:color w:val="8C1117"/>
+                <w:color w:val="0A4D80"/>
                 <w:sz w:val="16"/>
                 <w:szCs w:val="16"/>
               </w:rPr>
@@ -5351,7 +5351,7 @@
             <w:r>
               <w:rPr>
                 <w:rFonts w:ascii="Consolas" w:cs="Consolas" w:eastAsia="Consolas" w:hAnsi="Consolas"/>
-                <w:color w:val="8C1117"/>
+                <w:color w:val="0A4D80"/>
                 <w:sz w:val="16"/>
                 <w:szCs w:val="16"/>
               </w:rPr>
@@ -5403,7 +5403,7 @@
             <w:r>
               <w:rPr>
                 <w:rFonts w:ascii="Consolas" w:cs="Consolas" w:eastAsia="Consolas" w:hAnsi="Consolas"/>
-                <w:color w:val="8C1117"/>
+                <w:color w:val="0A4D80"/>
                 <w:sz w:val="16"/>
                 <w:szCs w:val="16"/>
               </w:rPr>
@@ -5459,7 +5459,7 @@
             <w:r>
               <w:rPr>
                 <w:rFonts w:ascii="Consolas" w:cs="Consolas" w:eastAsia="Consolas" w:hAnsi="Consolas"/>
-                <w:color w:val="8C1117"/>
+                <w:color w:val="0A4D80"/>
                 <w:sz w:val="16"/>
                 <w:szCs w:val="16"/>
               </w:rPr>
@@ -5509,7 +5509,7 @@
             <w:r>
               <w:rPr>
                 <w:rFonts w:ascii="Consolas" w:cs="Consolas" w:eastAsia="Consolas" w:hAnsi="Consolas"/>
-                <w:color w:val="8C1117"/>
+                <w:color w:val="0A4D80"/>
                 <w:sz w:val="16"/>
                 <w:szCs w:val="16"/>
               </w:rPr>
@@ -5565,7 +5565,7 @@
             <w:r>
               <w:rPr>
                 <w:rFonts w:ascii="Consolas" w:cs="Consolas" w:eastAsia="Consolas" w:hAnsi="Consolas"/>
-                <w:color w:val="8C1117"/>
+                <w:color w:val="0A4D80"/>
                 <w:sz w:val="16"/>
                 <w:szCs w:val="16"/>
               </w:rPr>
@@ -5617,7 +5617,7 @@
             <w:r>
               <w:rPr>
                 <w:rFonts w:ascii="Consolas" w:cs="Consolas" w:eastAsia="Consolas" w:hAnsi="Consolas"/>
-                <w:color w:val="8C1117"/>
+                <w:color w:val="0A4D80"/>
                 <w:sz w:val="16"/>
                 <w:szCs w:val="16"/>
               </w:rPr>
@@ -5673,7 +5673,7 @@
             <w:r>
               <w:rPr>
                 <w:rFonts w:ascii="Consolas" w:cs="Consolas" w:eastAsia="Consolas" w:hAnsi="Consolas"/>
-                <w:color w:val="8C1117"/>
+                <w:color w:val="0A4D80"/>
                 <w:sz w:val="16"/>
                 <w:szCs w:val="16"/>
               </w:rPr>
@@ -5723,7 +5723,7 @@
             <w:r>
               <w:rPr>
                 <w:rFonts w:ascii="Consolas" w:cs="Consolas" w:eastAsia="Consolas" w:hAnsi="Consolas"/>
-                <w:color w:val="8C1117"/>
+                <w:color w:val="0A4D80"/>
                 <w:sz w:val="16"/>
                 <w:szCs w:val="16"/>
               </w:rPr>
@@ -5779,7 +5779,7 @@
             <w:r>
               <w:rPr>
                 <w:rFonts w:ascii="Consolas" w:cs="Consolas" w:eastAsia="Consolas" w:hAnsi="Consolas"/>
-                <w:color w:val="8C1117"/>
+                <w:color w:val="0A4D80"/>
                 <w:sz w:val="16"/>
                 <w:szCs w:val="16"/>
               </w:rPr>
@@ -5831,7 +5831,7 @@
             <w:r>
               <w:rPr>
                 <w:rFonts w:ascii="Consolas" w:cs="Consolas" w:eastAsia="Consolas" w:hAnsi="Consolas"/>
-                <w:color w:val="8C1117"/>
+                <w:color w:val="0A4D80"/>
                 <w:sz w:val="16"/>
                 <w:szCs w:val="16"/>
               </w:rPr>
@@ -5889,7 +5889,7 @@
             <w:r>
               <w:rPr>
                 <w:rFonts w:ascii="Consolas" w:cs="Consolas" w:eastAsia="Consolas" w:hAnsi="Consolas"/>
-                <w:color w:val="8C1117"/>
+                <w:color w:val="0A4D80"/>
                 <w:sz w:val="16"/>
                 <w:szCs w:val="16"/>
               </w:rPr>
@@ -5939,7 +5939,7 @@
             <w:r>
               <w:rPr>
                 <w:rFonts w:ascii="Consolas" w:cs="Consolas" w:eastAsia="Consolas" w:hAnsi="Consolas"/>
-                <w:color w:val="8C1117"/>
+                <w:color w:val="0A4D80"/>
                 <w:sz w:val="16"/>
                 <w:szCs w:val="16"/>
               </w:rPr>
@@ -5995,7 +5995,7 @@
             <w:r>
               <w:rPr>
                 <w:rFonts w:ascii="Consolas" w:cs="Consolas" w:eastAsia="Consolas" w:hAnsi="Consolas"/>
-                <w:color w:val="8C1117"/>
+                <w:color w:val="0A4D80"/>
                 <w:sz w:val="16"/>
                 <w:szCs w:val="16"/>
               </w:rPr>
@@ -6047,7 +6047,7 @@
             <w:r>
               <w:rPr>
                 <w:rFonts w:ascii="Consolas" w:cs="Consolas" w:eastAsia="Consolas" w:hAnsi="Consolas"/>
-                <w:color w:val="8C1117"/>
+                <w:color w:val="0A4D80"/>
                 <w:sz w:val="16"/>
                 <w:szCs w:val="16"/>
               </w:rPr>
@@ -6103,7 +6103,7 @@
             <w:r>
               <w:rPr>
                 <w:rFonts w:ascii="Consolas" w:cs="Consolas" w:eastAsia="Consolas" w:hAnsi="Consolas"/>
-                <w:color w:val="8C1117"/>
+                <w:color w:val="0A4D80"/>
                 <w:sz w:val="16"/>
                 <w:szCs w:val="16"/>
               </w:rPr>
@@ -6153,7 +6153,7 @@
             <w:r>
               <w:rPr>
                 <w:rFonts w:ascii="Consolas" w:cs="Consolas" w:eastAsia="Consolas" w:hAnsi="Consolas"/>
-                <w:color w:val="8C1117"/>
+                <w:color w:val="0A4D80"/>
                 <w:sz w:val="16"/>
                 <w:szCs w:val="16"/>
               </w:rPr>
@@ -6202,7 +6202,7 @@
       <w:r>
         <w:rPr>
           <w:rFonts w:ascii="Consolas" w:cs="Consolas" w:eastAsia="Consolas" w:hAnsi="Consolas"/>
-          <w:color w:val="8C1117"/>
+          <w:color w:val="0A4D80"/>
           <w:sz w:val="19"/>
           <w:szCs w:val="19"/>
         </w:rPr>
@@ -6214,7 +6214,7 @@
       <w:r>
         <w:rPr>
           <w:rFonts w:ascii="Consolas" w:cs="Consolas" w:eastAsia="Consolas" w:hAnsi="Consolas"/>
-          <w:color w:val="8C1117"/>
+          <w:color w:val="0A4D80"/>
           <w:sz w:val="19"/>
           <w:szCs w:val="19"/>
         </w:rPr>
@@ -6242,7 +6242,7 @@
       <w:r>
         <w:rPr>
           <w:rFonts w:ascii="Consolas" w:cs="Consolas" w:eastAsia="Consolas" w:hAnsi="Consolas"/>
-          <w:color w:val="8C1117"/>
+          <w:color w:val="0A4D80"/>
           <w:sz w:val="19"/>
           <w:szCs w:val="19"/>
         </w:rPr>
@@ -6317,7 +6317,7 @@
         <w:tblW w:type="dxa" w:w="9638"/>
         <w:tblBorders>
           <w:top w:val="none" w:color="FFFFFF" w:sz="0"/>
-          <w:left w:val="single" w:color="D71920" w:sz="24"/>
+          <w:left w:val="single" w:color="0063A6" w:sz="24"/>
           <w:bottom w:val="none" w:color="FFFFFF" w:sz="0"/>
           <w:right w:val="none" w:color="FFFFFF" w:sz="0"/>
           <w:insideH w:val="none" w:color="FFFFFF" w:sz="0"/>
@@ -6334,7 +6334,7 @@
         <w:tc>
           <w:tcPr>
             <w:tcW w:type="dxa" w:w="9638"/>
-            <w:shd w:fill="FCEDEE" w:color="auto" w:val="clear"/>
+            <w:shd w:fill="E9F2F8" w:color="auto" w:val="clear"/>
             <w:tcMar>
               <w:top w:type="dxa" w:w="140"/>
               <w:left w:type="dxa" w:w="220"/>
@@ -6350,7 +6350,7 @@
               <w:rPr>
                 <w:b/>
                 <w:bCs/>
-                <w:color w:val="D71920"/>
+                <w:color w:val="0063A6"/>
                 <w:sz w:val="20"/>
                 <w:szCs w:val="20"/>
               </w:rPr>
@@ -6441,7 +6441,7 @@
         <w:tc>
           <w:tcPr>
             <w:tcW w:type="dxa" w:w="3900"/>
-            <w:shd w:fill="D71920" w:color="auto" w:val="clear"/>
+            <w:shd w:fill="0063A6" w:color="auto" w:val="clear"/>
             <w:tcMar>
               <w:top w:type="dxa" w:w="70"/>
               <w:left w:type="dxa" w:w="110"/>
@@ -6469,7 +6469,7 @@
         <w:tc>
           <w:tcPr>
             <w:tcW w:type="dxa" w:w="1300"/>
-            <w:shd w:fill="D71920" w:color="auto" w:val="clear"/>
+            <w:shd w:fill="0063A6" w:color="auto" w:val="clear"/>
             <w:tcMar>
               <w:top w:type="dxa" w:w="70"/>
               <w:left w:type="dxa" w:w="110"/>
@@ -6497,7 +6497,7 @@
         <w:tc>
           <w:tcPr>
             <w:tcW w:type="dxa" w:w="4438"/>
-            <w:shd w:fill="D71920" w:color="auto" w:val="clear"/>
+            <w:shd w:fill="0063A6" w:color="auto" w:val="clear"/>
             <w:tcMar>
               <w:top w:type="dxa" w:w="70"/>
               <w:left w:type="dxa" w:w="110"/>
@@ -7338,7 +7338,7 @@
         <w:tc>
           <w:tcPr>
             <w:tcW w:type="dxa" w:w="3200"/>
-            <w:shd w:fill="D71920" w:color="auto" w:val="clear"/>
+            <w:shd w:fill="0063A6" w:color="auto" w:val="clear"/>
             <w:tcMar>
               <w:top w:type="dxa" w:w="70"/>
               <w:left w:type="dxa" w:w="110"/>
@@ -7366,7 +7366,7 @@
         <w:tc>
           <w:tcPr>
             <w:tcW w:type="dxa" w:w="6438"/>
-            <w:shd w:fill="D71920" w:color="auto" w:val="clear"/>
+            <w:shd w:fill="0063A6" w:color="auto" w:val="clear"/>
             <w:tcMar>
               <w:top w:type="dxa" w:w="70"/>
               <w:left w:type="dxa" w:w="110"/>
@@ -8179,7 +8179,7 @@
       <w:r>
         <w:rPr>
           <w:rFonts w:ascii="Consolas" w:cs="Consolas" w:eastAsia="Consolas" w:hAnsi="Consolas"/>
-          <w:color w:val="8C1117"/>
+          <w:color w:val="0A4D80"/>
           <w:sz w:val="19"/>
           <w:szCs w:val="19"/>
         </w:rPr>
@@ -8191,7 +8191,7 @@
       <w:r>
         <w:rPr>
           <w:rFonts w:ascii="Consolas" w:cs="Consolas" w:eastAsia="Consolas" w:hAnsi="Consolas"/>
-          <w:color w:val="8C1117"/>
+          <w:color w:val="0A4D80"/>
           <w:sz w:val="19"/>
           <w:szCs w:val="19"/>
         </w:rPr>
@@ -8224,7 +8224,7 @@
         <w:tblW w:type="dxa" w:w="9638"/>
         <w:tblBorders>
           <w:top w:val="none" w:color="FFFFFF" w:sz="0"/>
-          <w:left w:val="single" w:color="D71920" w:sz="24"/>
+          <w:left w:val="single" w:color="0063A6" w:sz="24"/>
           <w:bottom w:val="none" w:color="FFFFFF" w:sz="0"/>
           <w:right w:val="none" w:color="FFFFFF" w:sz="0"/>
           <w:insideH w:val="none" w:color="FFFFFF" w:sz="0"/>
@@ -8241,7 +8241,7 @@
         <w:tc>
           <w:tcPr>
             <w:tcW w:type="dxa" w:w="9638"/>
-            <w:shd w:fill="FCEDEE" w:color="auto" w:val="clear"/>
+            <w:shd w:fill="E9F2F8" w:color="auto" w:val="clear"/>
             <w:tcMar>
               <w:top w:type="dxa" w:w="140"/>
               <w:left w:type="dxa" w:w="220"/>
@@ -8257,7 +8257,7 @@
               <w:rPr>
                 <w:b/>
                 <w:bCs/>
-                <w:color w:val="D71920"/>
+                <w:color w:val="0063A6"/>
                 <w:sz w:val="20"/>
                 <w:szCs w:val="20"/>
               </w:rPr>
@@ -8345,7 +8345,7 @@
         <w:tc>
           <w:tcPr>
             <w:tcW w:type="dxa" w:w="2800"/>
-            <w:shd w:fill="D71920" w:color="auto" w:val="clear"/>
+            <w:shd w:fill="0063A6" w:color="auto" w:val="clear"/>
             <w:tcMar>
               <w:top w:type="dxa" w:w="70"/>
               <w:left w:type="dxa" w:w="110"/>
@@ -8373,7 +8373,7 @@
         <w:tc>
           <w:tcPr>
             <w:tcW w:type="dxa" w:w="6838"/>
-            <w:shd w:fill="D71920" w:color="auto" w:val="clear"/>
+            <w:shd w:fill="0063A6" w:color="auto" w:val="clear"/>
             <w:tcMar>
               <w:top w:type="dxa" w:w="70"/>
               <w:left w:type="dxa" w:w="110"/>
@@ -8662,7 +8662,7 @@
         <w:tblW w:type="dxa" w:w="9638"/>
         <w:tblBorders>
           <w:top w:val="none" w:color="FFFFFF" w:sz="0"/>
-          <w:left w:val="single" w:color="D71920" w:sz="24"/>
+          <w:left w:val="single" w:color="0063A6" w:sz="24"/>
           <w:bottom w:val="none" w:color="FFFFFF" w:sz="0"/>
           <w:right w:val="none" w:color="FFFFFF" w:sz="0"/>
           <w:insideH w:val="none" w:color="FFFFFF" w:sz="0"/>
@@ -8679,7 +8679,7 @@
         <w:tc>
           <w:tcPr>
             <w:tcW w:type="dxa" w:w="9638"/>
-            <w:shd w:fill="FCEDEE" w:color="auto" w:val="clear"/>
+            <w:shd w:fill="E9F2F8" w:color="auto" w:val="clear"/>
             <w:tcMar>
               <w:top w:type="dxa" w:w="140"/>
               <w:left w:type="dxa" w:w="220"/>
@@ -8695,7 +8695,7 @@
               <w:rPr>
                 <w:b/>
                 <w:bCs/>
-                <w:color w:val="D71920"/>
+                <w:color w:val="0063A6"/>
                 <w:sz w:val="20"/>
                 <w:szCs w:val="20"/>
               </w:rPr>
@@ -8716,7 +8716,7 @@
             <w:r>
               <w:rPr>
                 <w:rFonts w:ascii="Consolas" w:cs="Consolas" w:eastAsia="Consolas" w:hAnsi="Consolas"/>
-                <w:color w:val="8C1117"/>
+                <w:color w:val="0A4D80"/>
                 <w:sz w:val="18"/>
                 <w:szCs w:val="18"/>
               </w:rPr>
@@ -9146,7 +9146,7 @@
         <w:tc>
           <w:tcPr>
             <w:tcW w:type="dxa" w:w="3200"/>
-            <w:shd w:fill="D71920" w:color="auto" w:val="clear"/>
+            <w:shd w:fill="0063A6" w:color="auto" w:val="clear"/>
             <w:tcMar>
               <w:top w:type="dxa" w:w="70"/>
               <w:left w:type="dxa" w:w="110"/>
@@ -9174,7 +9174,7 @@
         <w:tc>
           <w:tcPr>
             <w:tcW w:type="dxa" w:w="2400"/>
-            <w:shd w:fill="D71920" w:color="auto" w:val="clear"/>
+            <w:shd w:fill="0063A6" w:color="auto" w:val="clear"/>
             <w:tcMar>
               <w:top w:type="dxa" w:w="70"/>
               <w:left w:type="dxa" w:w="110"/>
@@ -9202,7 +9202,7 @@
         <w:tc>
           <w:tcPr>
             <w:tcW w:type="dxa" w:w="4038"/>
-            <w:shd w:fill="D71920" w:color="auto" w:val="clear"/>
+            <w:shd w:fill="0063A6" w:color="auto" w:val="clear"/>
             <w:tcMar>
               <w:top w:type="dxa" w:w="70"/>
               <w:left w:type="dxa" w:w="110"/>
@@ -9401,7 +9401,7 @@
       <w:r>
         <w:rPr>
           <w:rFonts w:ascii="Consolas" w:cs="Consolas" w:eastAsia="Consolas" w:hAnsi="Consolas"/>
-          <w:color w:val="8C1117"/>
+          <w:color w:val="0A4D80"/>
           <w:sz w:val="19"/>
           <w:szCs w:val="19"/>
         </w:rPr>
@@ -9464,7 +9464,7 @@
         <w:tc>
           <w:tcPr>
             <w:tcW w:type="dxa" w:w="4200"/>
-            <w:shd w:fill="D71920" w:color="auto" w:val="clear"/>
+            <w:shd w:fill="0063A6" w:color="auto" w:val="clear"/>
             <w:tcMar>
               <w:top w:type="dxa" w:w="70"/>
               <w:left w:type="dxa" w:w="110"/>
@@ -9492,7 +9492,7 @@
         <w:tc>
           <w:tcPr>
             <w:tcW w:type="dxa" w:w="5438"/>
-            <w:shd w:fill="D71920" w:color="auto" w:val="clear"/>
+            <w:shd w:fill="0063A6" w:color="auto" w:val="clear"/>
             <w:tcMar>
               <w:top w:type="dxa" w:w="70"/>
               <w:left w:type="dxa" w:w="110"/>
@@ -10427,7 +10427,7 @@
       <w:r>
         <w:rPr>
           <w:rFonts w:ascii="Consolas" w:cs="Consolas" w:eastAsia="Consolas" w:hAnsi="Consolas"/>
-          <w:color w:val="8C1117"/>
+          <w:color w:val="0A4D80"/>
           <w:sz w:val="19"/>
           <w:szCs w:val="19"/>
         </w:rPr>
@@ -10439,7 +10439,7 @@
       <w:r>
         <w:rPr>
           <w:rFonts w:ascii="Consolas" w:cs="Consolas" w:eastAsia="Consolas" w:hAnsi="Consolas"/>
-          <w:color w:val="8C1117"/>
+          <w:color w:val="0A4D80"/>
           <w:sz w:val="19"/>
           <w:szCs w:val="19"/>
         </w:rPr>
@@ -10685,7 +10685,7 @@
       <w:r>
         <w:rPr>
           <w:rFonts w:ascii="Consolas" w:cs="Consolas" w:eastAsia="Consolas" w:hAnsi="Consolas"/>
-          <w:color w:val="8C1117"/>
+          <w:color w:val="0A4D80"/>
           <w:sz w:val="19"/>
           <w:szCs w:val="19"/>
         </w:rPr>
@@ -10697,7 +10697,7 @@
       <w:r>
         <w:rPr>
           <w:rFonts w:ascii="Consolas" w:cs="Consolas" w:eastAsia="Consolas" w:hAnsi="Consolas"/>
-          <w:color w:val="8C1117"/>
+          <w:color w:val="0A4D80"/>
           <w:sz w:val="19"/>
           <w:szCs w:val="19"/>
         </w:rPr>
@@ -10822,7 +10822,7 @@
         <w:tblW w:type="dxa" w:w="9638"/>
         <w:tblBorders>
           <w:top w:val="none" w:color="FFFFFF" w:sz="0"/>
-          <w:left w:val="single" w:color="D71920" w:sz="24"/>
+          <w:left w:val="single" w:color="0063A6" w:sz="24"/>
           <w:bottom w:val="none" w:color="FFFFFF" w:sz="0"/>
           <w:right w:val="none" w:color="FFFFFF" w:sz="0"/>
           <w:insideH w:val="none" w:color="FFFFFF" w:sz="0"/>
@@ -10839,7 +10839,7 @@
         <w:tc>
           <w:tcPr>
             <w:tcW w:type="dxa" w:w="9638"/>
-            <w:shd w:fill="FCEDEE" w:color="auto" w:val="clear"/>
+            <w:shd w:fill="E9F2F8" w:color="auto" w:val="clear"/>
             <w:tcMar>
               <w:top w:type="dxa" w:w="140"/>
               <w:left w:type="dxa" w:w="220"/>
@@ -10855,7 +10855,7 @@
               <w:rPr>
                 <w:b/>
                 <w:bCs/>
-                <w:color w:val="D71920"/>
+                <w:color w:val="0063A6"/>
                 <w:sz w:val="20"/>
                 <w:szCs w:val="20"/>
               </w:rPr>
@@ -10941,7 +10941,7 @@
       <w:r>
         <w:rPr>
           <w:rFonts w:ascii="Consolas" w:cs="Consolas" w:eastAsia="Consolas" w:hAnsi="Consolas"/>
-          <w:color w:val="8C1117"/>
+          <w:color w:val="0A4D80"/>
           <w:sz w:val="19"/>
           <w:szCs w:val="19"/>
         </w:rPr>
@@ -10953,7 +10953,7 @@
       <w:r>
         <w:rPr>
           <w:rFonts w:ascii="Consolas" w:cs="Consolas" w:eastAsia="Consolas" w:hAnsi="Consolas"/>
-          <w:color w:val="8C1117"/>
+          <w:color w:val="0A4D80"/>
           <w:sz w:val="19"/>
           <w:szCs w:val="19"/>
         </w:rPr>
@@ -10995,7 +10995,7 @@
         <w:tc>
           <w:tcPr>
             <w:tcW w:type="dxa" w:w="3800"/>
-            <w:shd w:fill="D71920" w:color="auto" w:val="clear"/>
+            <w:shd w:fill="0063A6" w:color="auto" w:val="clear"/>
             <w:tcMar>
               <w:top w:type="dxa" w:w="70"/>
               <w:left w:type="dxa" w:w="110"/>
@@ -11023,7 +11023,7 @@
         <w:tc>
           <w:tcPr>
             <w:tcW w:type="dxa" w:w="3500"/>
-            <w:shd w:fill="D71920" w:color="auto" w:val="clear"/>
+            <w:shd w:fill="0063A6" w:color="auto" w:val="clear"/>
             <w:tcMar>
               <w:top w:type="dxa" w:w="70"/>
               <w:left w:type="dxa" w:w="110"/>
@@ -11051,7 +11051,7 @@
         <w:tc>
           <w:tcPr>
             <w:tcW w:type="dxa" w:w="2338"/>
-            <w:shd w:fill="D71920" w:color="auto" w:val="clear"/>
+            <w:shd w:fill="0063A6" w:color="auto" w:val="clear"/>
             <w:tcMar>
               <w:top w:type="dxa" w:w="70"/>
               <w:left w:type="dxa" w:w="110"/>
@@ -11450,7 +11450,7 @@
         <w:tc>
           <w:tcPr>
             <w:tcW w:type="dxa" w:w="3600"/>
-            <w:shd w:fill="D71920" w:color="auto" w:val="clear"/>
+            <w:shd w:fill="0063A6" w:color="auto" w:val="clear"/>
             <w:tcMar>
               <w:top w:type="dxa" w:w="70"/>
               <w:left w:type="dxa" w:w="110"/>
@@ -11478,7 +11478,7 @@
         <w:tc>
           <w:tcPr>
             <w:tcW w:type="dxa" w:w="6038"/>
-            <w:shd w:fill="D71920" w:color="auto" w:val="clear"/>
+            <w:shd w:fill="0063A6" w:color="auto" w:val="clear"/>
             <w:tcMar>
               <w:top w:type="dxa" w:w="70"/>
               <w:left w:type="dxa" w:w="110"/>
@@ -12077,7 +12077,7 @@
         <w:tblW w:type="dxa" w:w="9638"/>
         <w:tblBorders>
           <w:top w:val="none" w:color="FFFFFF" w:sz="0"/>
-          <w:left w:val="single" w:color="D71920" w:sz="24"/>
+          <w:left w:val="single" w:color="0063A6" w:sz="24"/>
           <w:bottom w:val="none" w:color="FFFFFF" w:sz="0"/>
           <w:right w:val="none" w:color="FFFFFF" w:sz="0"/>
           <w:insideH w:val="none" w:color="FFFFFF" w:sz="0"/>
@@ -12094,7 +12094,7 @@
         <w:tc>
           <w:tcPr>
             <w:tcW w:type="dxa" w:w="9638"/>
-            <w:shd w:fill="FCEDEE" w:color="auto" w:val="clear"/>
+            <w:shd w:fill="E9F2F8" w:color="auto" w:val="clear"/>
             <w:tcMar>
               <w:top w:type="dxa" w:w="140"/>
               <w:left w:type="dxa" w:w="220"/>
@@ -12110,7 +12110,7 @@
               <w:rPr>
                 <w:b/>
                 <w:bCs/>
-                <w:color w:val="D71920"/>
+                <w:color w:val="0063A6"/>
                 <w:sz w:val="20"/>
                 <w:szCs w:val="20"/>
               </w:rPr>
@@ -12147,7 +12147,7 @@
       <w:r>
         <w:rPr>
           <w:rFonts w:ascii="Consolas" w:cs="Consolas" w:eastAsia="Consolas" w:hAnsi="Consolas"/>
-          <w:color w:val="8C1117"/>
+          <w:color w:val="0A4D80"/>
           <w:sz w:val="19"/>
           <w:szCs w:val="19"/>
         </w:rPr>
@@ -12159,7 +12159,7 @@
       <w:r>
         <w:rPr>
           <w:rFonts w:ascii="Consolas" w:cs="Consolas" w:eastAsia="Consolas" w:hAnsi="Consolas"/>
-          <w:color w:val="8C1117"/>
+          <w:color w:val="0A4D80"/>
           <w:sz w:val="19"/>
           <w:szCs w:val="19"/>
         </w:rPr>
@@ -12171,7 +12171,7 @@
       <w:r>
         <w:rPr>
           <w:rFonts w:ascii="Consolas" w:cs="Consolas" w:eastAsia="Consolas" w:hAnsi="Consolas"/>
-          <w:color w:val="8C1117"/>
+          <w:color w:val="0A4D80"/>
           <w:sz w:val="19"/>
           <w:szCs w:val="19"/>
         </w:rPr>
@@ -12212,7 +12212,7 @@
         <w:tc>
           <w:tcPr>
             <w:tcW w:type="dxa" w:w="2600"/>
-            <w:shd w:fill="D71920" w:color="auto" w:val="clear"/>
+            <w:shd w:fill="0063A6" w:color="auto" w:val="clear"/>
             <w:tcMar>
               <w:top w:type="dxa" w:w="70"/>
               <w:left w:type="dxa" w:w="110"/>
@@ -12240,7 +12240,7 @@
         <w:tc>
           <w:tcPr>
             <w:tcW w:type="dxa" w:w="7038"/>
-            <w:shd w:fill="D71920" w:color="auto" w:val="clear"/>
+            <w:shd w:fill="0063A6" w:color="auto" w:val="clear"/>
             <w:tcMar>
               <w:top w:type="dxa" w:w="70"/>
               <w:left w:type="dxa" w:w="110"/>
@@ -12576,7 +12576,7 @@
       <w:r>
         <w:rPr>
           <w:rFonts w:ascii="Consolas" w:cs="Consolas" w:eastAsia="Consolas" w:hAnsi="Consolas"/>
-          <w:color w:val="8C1117"/>
+          <w:color w:val="0A4D80"/>
           <w:sz w:val="19"/>
           <w:szCs w:val="19"/>
         </w:rPr>
@@ -12601,7 +12601,7 @@
         <w:tblW w:type="dxa" w:w="9638"/>
         <w:tblBorders>
           <w:top w:val="none" w:color="FFFFFF" w:sz="0"/>
-          <w:left w:val="single" w:color="D71920" w:sz="24"/>
+          <w:left w:val="single" w:color="0063A6" w:sz="24"/>
           <w:bottom w:val="none" w:color="FFFFFF" w:sz="0"/>
           <w:right w:val="none" w:color="FFFFFF" w:sz="0"/>
           <w:insideH w:val="none" w:color="FFFFFF" w:sz="0"/>
@@ -12618,7 +12618,7 @@
         <w:tc>
           <w:tcPr>
             <w:tcW w:type="dxa" w:w="9638"/>
-            <w:shd w:fill="FCEDEE" w:color="auto" w:val="clear"/>
+            <w:shd w:fill="E9F2F8" w:color="auto" w:val="clear"/>
             <w:tcMar>
               <w:top w:type="dxa" w:w="140"/>
               <w:left w:type="dxa" w:w="220"/>
@@ -12634,7 +12634,7 @@
               <w:rPr>
                 <w:b/>
                 <w:bCs/>
-                <w:color w:val="D71920"/>
+                <w:color w:val="0063A6"/>
                 <w:sz w:val="20"/>
                 <w:szCs w:val="20"/>
               </w:rPr>
@@ -12703,7 +12703,7 @@
       </w:pPr>
       <w:r>
         <w:rPr>
-          <w:color w:val="D71920"/>
+          <w:color w:val="0063A6"/>
           <w:sz w:val="24"/>
           <w:szCs w:val="24"/>
         </w:rPr>
@@ -12740,7 +12740,7 @@
       <w:r>
         <w:drawing>
           <wp:inline distT="0" distB="0" distL="0" distR="0">
-            <wp:extent cx="1428750" cy="457200"/>
+            <wp:extent cx="1428750" cy="495300"/>
             <wp:effectExtent t="0" r="0" b="0" l="0"/>
             <wp:docPr id="1" name="" descr="" title=""/>
             <wp:cNvGraphicFramePr>
@@ -12765,7 +12765,7 @@
                   <pic:spPr bwMode="auto">
                     <a:xfrm>
                       <a:off x="0" y="0"/>
-                      <a:ext cx="1428750" cy="457200"/>
+                      <a:ext cx="1428750" cy="495300"/>
                     </a:xfrm>
                     <a:prstGeom prst="rect">
                       <a:avLst/>
@@ -12878,7 +12878,7 @@
       <w:rPr>
         <w:b/>
         <w:bCs/>
-        <w:color w:val="D71920"/>
+        <w:color w:val="0063A6"/>
         <w:sz w:val="16"/>
         <w:szCs w:val="16"/>
       </w:rPr>
@@ -12898,7 +12898,7 @@
     <w:r>
       <w:drawing>
         <wp:inline distT="0" distB="0" distL="0" distR="0">
-          <wp:extent cx="647700" cy="209550"/>
+          <wp:extent cx="647700" cy="228600"/>
           <wp:effectExtent t="0" r="0" b="0" l="0"/>
           <wp:docPr id="1" name="" descr="" title=""/>
           <wp:cNvGraphicFramePr>
@@ -12923,7 +12923,7 @@
                 <pic:spPr bwMode="auto">
                   <a:xfrm>
                     <a:off x="0" y="0"/>
-                    <a:ext cx="647700" cy="209550"/>
+                    <a:ext cx="647700" cy="228600"/>
                   </a:xfrm>
                   <a:prstGeom prst="rect">
                     <a:avLst/>
@@ -13036,7 +13036,7 @@
         <w:ind w:left="400" w:hanging="280"/>
       </w:pPr>
       <w:rPr>
-        <w:color w:val="D71920"/>
+        <w:color w:val="0063A6"/>
         <w:sz w:val="14"/>
         <w:szCs w:val="14"/>
       </w:rPr>
@@ -13055,7 +13055,7 @@
       <w:rPr>
         <w:b/>
         <w:bCs/>
-        <w:color w:val="D71920"/>
+        <w:color w:val="0063A6"/>
       </w:rPr>
     </w:lvl>
   </w:abstractNum>
@@ -13240,7 +13240,7 @@
       <w:rFonts w:ascii="Arial" w:cs="Arial" w:eastAsia="Arial" w:hAnsi="Arial"/>
       <w:b/>
       <w:bCs/>
-      <w:color w:val="D71920"/>
+      <w:color w:val="0063A6"/>
       <w:sz w:val="40"/>
       <w:szCs w:val="40"/>
     </w:rPr>

</xml_diff>

<commit_message>
DOC: Versionsvergleich beim Transport beschrieben
Spezifikation 4.1b mit den beiden Eigenheiten der Versionsverwaltung -
die Versionsnummer taugt nicht als Reihenfolge, und ein Objekt besteht
aus mehreren Versionsobjekten -, beide HTML-Fassungen, die
Reportdokumentation im System und beide Handbuch-Skripte.

Das deutsche Handbuch ist neu gebaut (24 Seiten, Abschnitt auf Seite
13). Das englische fehlt: die Datei ist in Word geoeffnet.

Co-Authored-By: Claude Opus 5 <noreply@anthropic.com>
</commit_message>
<xml_diff>
--- a/docs/Documizer_Produktdokumentation.docx
+++ b/docs/Documizer_Produktdokumentation.docx
@@ -6418,6 +6418,242 @@
       <w:pPr>
         <w:spacing w:after="180"/>
       </w:pPr>
+    </w:p>
+    <w:p>
+      <w:pPr>
+        <w:pStyle w:val="Heading2"/>
+      </w:pPr>
+      <w:r>
+        <w:t xml:space="preserve">Was sich gegenüber dem vorigen Transport geändert hat</w:t>
+      </w:r>
+    </w:p>
+    <w:p>
+      <w:pPr>
+        <w:spacing w:after="140" w:line="288"/>
+      </w:pPr>
+      <w:r>
+        <w:t xml:space="preserve">Mit dem Kennzeichen </w:t>
+      </w:r>
+      <w:r>
+        <w:rPr>
+          <w:i/>
+          <w:iCs/>
+        </w:rPr>
+        <w:t xml:space="preserve">Änderungen zur Vorversion</w:t>
+      </w:r>
+      <w:r>
+        <w:t xml:space="preserve"> steht in jedem Objektkapitel, was dieser Transport gegenüber dem vorigen ändert — grün, rot und mit Umgebung, genau wie der Vergleich im Testlauf des Imports:</w:t>
+      </w:r>
+    </w:p>
+    <w:tbl>
+      <w:tblPr>
+        <w:tblW w:type="dxa" w:w="9638"/>
+        <w:tblBorders>
+          <w:top w:val="none" w:color="FFFFFF" w:sz="0"/>
+          <w:left w:val="single" w:color="808285" w:sz="18"/>
+          <w:bottom w:val="none" w:color="FFFFFF" w:sz="0"/>
+          <w:right w:val="none" w:color="FFFFFF" w:sz="0"/>
+          <w:insideH w:val="none" w:color="FFFFFF" w:sz="0"/>
+          <w:insideV w:val="none" w:color="FFFFFF" w:sz="0"/>
+        </w:tblBorders>
+      </w:tblPr>
+      <w:tblGrid>
+        <w:gridCol w:w="9638"/>
+      </w:tblGrid>
+      <w:tr>
+        <w:trPr>
+          <w:cantSplit/>
+        </w:trPr>
+        <w:tc>
+          <w:tcPr>
+            <w:tcW w:type="dxa" w:w="9638"/>
+            <w:shd w:fill="F4F4F5" w:color="auto" w:val="clear"/>
+            <w:tcMar>
+              <w:top w:type="dxa" w:w="120"/>
+              <w:left w:type="dxa" w:w="200"/>
+              <w:bottom w:type="dxa" w:w="120"/>
+              <w:right w:type="dxa" w:w="200"/>
+            </w:tcMar>
+          </w:tcPr>
+          <w:p>
+            <w:pPr>
+              <w:spacing w:after="0" w:line="240"/>
+            </w:pPr>
+            <w:r>
+              <w:rPr>
+                <w:rFonts w:ascii="Consolas" w:cs="Consolas" w:eastAsia="Consolas" w:hAnsi="Consolas"/>
+                <w:color w:val="2B2B2B"/>
+                <w:sz w:val="16"/>
+                <w:szCs w:val="16"/>
+              </w:rPr>
+              <w:t xml:space="preserve">Aenderungen gegenueber EBSK900017 vom 2017-10-07: +4 / -1 Zeilen</w:t>
+            </w:r>
+          </w:p>
+          <w:p>
+            <w:pPr>
+              <w:spacing w:after="0" w:line="240"/>
+            </w:pPr>
+            <w:r>
+              <w:rPr>
+                <w:rFonts w:ascii="Consolas" w:cs="Consolas" w:eastAsia="Consolas" w:hAnsi="Consolas"/>
+                <w:color w:val="2B2B2B"/>
+                <w:sz w:val="16"/>
+                <w:szCs w:val="16"/>
+              </w:rPr>
+              <w:t xml:space="preserve">     8   PARAMETERS: p_vbeln TYPE vbak-vbeln .</w:t>
+            </w:r>
+          </w:p>
+          <w:p>
+            <w:pPr>
+              <w:spacing w:after="0" w:line="240"/>
+            </w:pPr>
+            <w:r>
+              <w:rPr>
+                <w:rFonts w:ascii="Consolas" w:cs="Consolas" w:eastAsia="Consolas" w:hAnsi="Consolas"/>
+                <w:color w:val="2B2B2B"/>
+                <w:sz w:val="16"/>
+                <w:szCs w:val="16"/>
+              </w:rPr>
+              <w:t xml:space="preserve">     9 - PARAMETERS : ordtype TYPE auart DEFAULT 'ZCM'.</w:t>
+            </w:r>
+          </w:p>
+          <w:p>
+            <w:pPr>
+              <w:spacing w:after="0" w:line="240"/>
+            </w:pPr>
+            <w:r>
+              <w:rPr>
+                <w:rFonts w:ascii="Consolas" w:cs="Consolas" w:eastAsia="Consolas" w:hAnsi="Consolas"/>
+                <w:color w:val="2B2B2B"/>
+                <w:sz w:val="16"/>
+                <w:szCs w:val="16"/>
+              </w:rPr>
+              <w:t xml:space="preserve">     9 + *{   REPLACE        S4HK901040</w:t>
+            </w:r>
+          </w:p>
+          <w:p>
+            <w:pPr>
+              <w:spacing w:after="0" w:line="240"/>
+            </w:pPr>
+            <w:r>
+              <w:rPr>
+                <w:rFonts w:ascii="Consolas" w:cs="Consolas" w:eastAsia="Consolas" w:hAnsi="Consolas"/>
+                <w:color w:val="2B2B2B"/>
+                <w:sz w:val="16"/>
+                <w:szCs w:val="16"/>
+              </w:rPr>
+              <w:t xml:space="preserve">    11 + PARAMETERS : ordtype TYPE auart DEFAULT 'OR'.</w:t>
+            </w:r>
+          </w:p>
+          <w:p>
+            <w:pPr>
+              <w:spacing w:after="0" w:line="240"/>
+            </w:pPr>
+            <w:r>
+              <w:rPr>
+                <w:rFonts w:ascii="Consolas" w:cs="Consolas" w:eastAsia="Consolas" w:hAnsi="Consolas"/>
+                <w:color w:val="2B2B2B"/>
+                <w:sz w:val="16"/>
+                <w:szCs w:val="16"/>
+              </w:rPr>
+              <w:t xml:space="preserve">    13   PARAMETERS : fromdate TYPE dats,</w:t>
+            </w:r>
+          </w:p>
+        </w:tc>
+      </w:tr>
+    </w:tbl>
+    <w:p>
+      <w:pPr>
+        <w:spacing w:after="180"/>
+      </w:pPr>
+    </w:p>
+    <w:p>
+      <w:pPr>
+        <w:spacing w:after="140" w:line="288"/>
+      </w:pPr>
+      <w:r>
+        <w:t xml:space="preserve">Beide Fassungen kommen aus der </w:t>
+      </w:r>
+      <w:r>
+        <w:rPr>
+          <w:b/>
+          <w:bCs/>
+        </w:rPr>
+        <w:t xml:space="preserve">Versionsverwaltung</w:t>
+      </w:r>
+      <w:r>
+        <w:t xml:space="preserve">: Beim Freigeben legt SAP je Objekt eine Version an und merkt sich die Auftragsnummer dazu. Die Version dieses Transports ist die mit seiner Nummer, der Vorgänger die nächstältere — gleich aus welchem Auftrag sie stammt, auch aus einem anderen System.</w:t>
+      </w:r>
+    </w:p>
+    <w:p>
+      <w:pPr>
+        <w:pStyle w:val="ListParagraph"/>
+        <w:numPr>
+          <w:ilvl w:val="0"/>
+          <w:numId w:val="2"/>
+        </w:numPr>
+        <w:spacing w:after="80" w:line="276"/>
+      </w:pPr>
+      <w:r>
+        <w:rPr>
+          <w:b/>
+          <w:bCs/>
+        </w:rPr>
+        <w:t xml:space="preserve">Verglichen wird Teil für Teil.</w:t>
+      </w:r>
+      <w:r>
+        <w:t xml:space="preserve"> Eine Klasse besteht in der Versionsverwaltung aus Definition, den drei Abschnitten und je Methode einem Eintrag, eine Funktionsgruppe aus ihren Bausteinen. Jeder Teil bekommt seine eigene Überschrift.</w:t>
+      </w:r>
+    </w:p>
+    <w:p>
+      <w:pPr>
+        <w:pStyle w:val="ListParagraph"/>
+        <w:numPr>
+          <w:ilvl w:val="0"/>
+          <w:numId w:val="2"/>
+        </w:numPr>
+        <w:spacing w:after="80" w:line="276"/>
+      </w:pPr>
+      <w:r>
+        <w:rPr>
+          <w:b/>
+          <w:bCs/>
+        </w:rPr>
+        <w:t xml:space="preserve">Noch nicht freigegeben?</w:t>
+      </w:r>
+      <w:r>
+        <w:t xml:space="preserve"> Dann gibt es für den Auftrag noch keine Version, und es steht der aktuelle Stand gegen die jüngste vorhandene — das, was dieser Transport bringen </w:t>
+      </w:r>
+      <w:r>
+        <w:rPr>
+          <w:i/>
+          <w:iCs/>
+        </w:rPr>
+        <w:t xml:space="preserve">wird</w:t>
+      </w:r>
+      <w:r>
+        <w:t xml:space="preserve">, gegen das, was zuletzt transportiert wurde. Vor einer Abnahme ist genau das die Frage.</w:t>
+      </w:r>
+    </w:p>
+    <w:p>
+      <w:pPr>
+        <w:pStyle w:val="ListParagraph"/>
+        <w:numPr>
+          <w:ilvl w:val="0"/>
+          <w:numId w:val="2"/>
+        </w:numPr>
+        <w:spacing w:after="80" w:line="276"/>
+      </w:pPr>
+      <w:r>
+        <w:rPr>
+          <w:b/>
+          <w:bCs/>
+        </w:rPr>
+        <w:t xml:space="preserve">Nicht jede Objektart hat Versionen</w:t>
+      </w:r>
+      <w:r>
+        <w:t xml:space="preserve"> — UI5-Anwendungen und Formulare etwa nicht. Dort entfällt der Vergleich; wie viele Objekte verglichen wurden, steht am Ende des Laufs.</w:t>
+      </w:r>
     </w:p>
     <w:p>
       <w:pPr>

</xml_diff>